<commit_message>
fix: correct all 14 verification errors across EN/HE docs and exec summaries
Co-authored-by: Cursor <cursoragent@cursor.com>
</commit_message>
<xml_diff>
--- a/exports/executive-summary-en.docx
+++ b/exports/executive-summary-en.docx
@@ -531,7 +531,7 @@
               <w:rPr>
                 <w:sz w:val="18"/>
               </w:rPr>
-              <w:t>$3.50 energy ($50-100M system)</w:t>
+              <w:t>$5-10 energy ($50-100M system)</w:t>
             </w:r>
           </w:p>
         </w:tc>
@@ -1415,7 +1415,7 @@
     <w:p/>
     <w:p>
       <w:r>
-        <w:t>Context: Israel's defense budget &gt;$30B/year. Iron Dome cost ~$3B. One night's Patriot defense costs $200M+.</w:t>
+        <w:t>Context: Israel's defense budget &gt;$45B/year (2026). Iron Dome cost ~$3B. One night's Patriot defense costs $200M+.</w:t>
       </w:r>
     </w:p>
     <w:p>

</xml_diff>

<commit_message>
feat: add 14A intermediate solution (6-month IOC) and 14B tactical employment with ground forces, verified specs
Co-authored-by: Cursor <cursoragent@cursor.com>
</commit_message>
<xml_diff>
--- a/exports/executive-summary-en.docx
+++ b/exports/executive-summary-en.docx
@@ -1584,7 +1584,218 @@
     </w:p>
     <w:p>
       <w:r>
-        <w:t>*Full research document (40+ pages) available upon request.*</w:t>
+        <w:br w:type="page"/>
+      </w:r>
+    </w:p>
+    <w:p>
+      <w:pPr>
+        <w:pStyle w:val="Heading2"/>
+      </w:pPr>
+      <w:r>
+        <w:t>Intermediate Solution (Deployable in 6 Months)</w:t>
+      </w:r>
+    </w:p>
+    <w:p>
+      <w:r>
+        <w:t>Deploy 10–40 tactical aerostats (Skystar 180/DURUS class, already in IDF service) with CF cable pendants at border chokepoints.</w:t>
+      </w:r>
+    </w:p>
+    <w:tbl>
+      <w:tblPr>
+        <w:tblStyle w:val="TableGrid"/>
+        <w:tblW w:type="auto" w:w="0"/>
+        <w:jc w:val="center"/>
+        <w:tblLook w:firstColumn="1" w:firstRow="1" w:lastColumn="0" w:lastRow="0" w:noHBand="0" w:noVBand="1" w:val="04A0"/>
+      </w:tblPr>
+      <w:tblGrid>
+        <w:gridCol w:w="4680"/>
+        <w:gridCol w:w="4680"/>
+      </w:tblGrid>
+      <w:tr>
+        <w:tc>
+          <w:tcPr>
+            <w:tcW w:type="dxa" w:w="4680"/>
+          </w:tcPr>
+          <w:p>
+            <w:r>
+              <w:rPr>
+                <w:b/>
+                <w:sz w:val="18"/>
+              </w:rPr>
+              <w:t>Parameter</w:t>
+            </w:r>
+          </w:p>
+        </w:tc>
+        <w:tc>
+          <w:tcPr>
+            <w:tcW w:type="dxa" w:w="4680"/>
+          </w:tcPr>
+          <w:p>
+            <w:r>
+              <w:rPr>
+                <w:b/>
+                <w:sz w:val="18"/>
+              </w:rPr>
+              <w:t>Value</w:t>
+            </w:r>
+          </w:p>
+        </w:tc>
+      </w:tr>
+      <w:tr>
+        <w:tc>
+          <w:tcPr>
+            <w:tcW w:type="dxa" w:w="4680"/>
+          </w:tcPr>
+          <w:p>
+            <w:r>
+              <w:rPr>
+                <w:sz w:val="18"/>
+              </w:rPr>
+              <w:t>Coverage per battery (10 units)</w:t>
+            </w:r>
+          </w:p>
+        </w:tc>
+        <w:tc>
+          <w:tcPr>
+            <w:tcW w:type="dxa" w:w="4680"/>
+          </w:tcPr>
+          <w:p>
+            <w:r>
+              <w:rPr>
+                <w:sz w:val="18"/>
+              </w:rPr>
+              <w:t>2.5 km continuous barrier</w:t>
+            </w:r>
+          </w:p>
+        </w:tc>
+      </w:tr>
+      <w:tr>
+        <w:tc>
+          <w:tcPr>
+            <w:tcW w:type="dxa" w:w="4680"/>
+          </w:tcPr>
+          <w:p>
+            <w:r>
+              <w:rPr>
+                <w:sz w:val="18"/>
+              </w:rPr>
+              <w:t>Barrier height</w:t>
+            </w:r>
+          </w:p>
+        </w:tc>
+        <w:tc>
+          <w:tcPr>
+            <w:tcW w:type="dxa" w:w="4680"/>
+          </w:tcPr>
+          <w:p>
+            <w:r>
+              <w:rPr>
+                <w:sz w:val="18"/>
+              </w:rPr>
+              <w:t>Ground level to 300–500m</w:t>
+            </w:r>
+          </w:p>
+        </w:tc>
+      </w:tr>
+      <w:tr>
+        <w:tc>
+          <w:tcPr>
+            <w:tcW w:type="dxa" w:w="4680"/>
+          </w:tcPr>
+          <w:p>
+            <w:r>
+              <w:rPr>
+                <w:sz w:val="18"/>
+              </w:rPr>
+              <w:t>Investment</w:t>
+            </w:r>
+          </w:p>
+        </w:tc>
+        <w:tc>
+          <w:tcPr>
+            <w:tcW w:type="dxa" w:w="4680"/>
+          </w:tcPr>
+          <w:p>
+            <w:r>
+              <w:rPr>
+                <w:sz w:val="18"/>
+              </w:rPr>
+              <w:t>$3–10M per sector</w:t>
+            </w:r>
+          </w:p>
+        </w:tc>
+      </w:tr>
+      <w:tr>
+        <w:tc>
+          <w:tcPr>
+            <w:tcW w:type="dxa" w:w="4680"/>
+          </w:tcPr>
+          <w:p>
+            <w:r>
+              <w:rPr>
+                <w:sz w:val="18"/>
+              </w:rPr>
+              <w:t>Deploy time</w:t>
+            </w:r>
+          </w:p>
+        </w:tc>
+        <w:tc>
+          <w:tcPr>
+            <w:tcW w:type="dxa" w:w="4680"/>
+          </w:tcPr>
+          <w:p>
+            <w:r>
+              <w:rPr>
+                <w:sz w:val="18"/>
+              </w:rPr>
+              <w:t>30 minutes per aerostat</w:t>
+            </w:r>
+          </w:p>
+        </w:tc>
+      </w:tr>
+      <w:tr>
+        <w:tc>
+          <w:tcPr>
+            <w:tcW w:type="dxa" w:w="4680"/>
+          </w:tcPr>
+          <w:p>
+            <w:r>
+              <w:rPr>
+                <w:sz w:val="18"/>
+              </w:rPr>
+              <w:t>Tactical mobility</w:t>
+            </w:r>
+          </w:p>
+        </w:tc>
+        <w:tc>
+          <w:tcPr>
+            <w:tcW w:type="dxa" w:w="4680"/>
+          </w:tcPr>
+          <w:p>
+            <w:r>
+              <w:rPr>
+                <w:sz w:val="18"/>
+              </w:rPr>
+              <w:t>Trailer-based, moves with ground forces</w:t>
+            </w:r>
+          </w:p>
+        </w:tc>
+      </w:tr>
+    </w:tbl>
+    <w:p/>
+    <w:p>
+      <w:r>
+        <w:t>Also operates tactically: FOB perimeter defense (30-min setup), convoy escort (leapfrog method), assembly area protection. Same equipment serves mobile, semi-static, and static missions.</w:t>
+      </w:r>
+    </w:p>
+    <w:p>
+      <w:r>
+        <w:br w:type="page"/>
+      </w:r>
+    </w:p>
+    <w:p>
+      <w:r>
+        <w:t>*Full research document (60+ pages) available upon request.*</w:t>
       </w:r>
     </w:p>
     <w:p>

</xml_diff>